<commit_message>
docs: add live Vercel deployment URL to README and proposal
</commit_message>
<xml_diff>
--- a/InternSync-Proposal.docx
+++ b/InternSync-Proposal.docx
@@ -238,7 +238,76 @@
                 <w:sz w:val="20"/>
                 <w:szCs w:val="20"/>
               </w:rPr>
-              <w:t xml:space="preserve">Sasaran Pengguna</w:t>
+              <w:t xml:space="preserve">Live Demo Website</w:t>
+            </w:r>
+          </w:p>
+        </w:tc>
+        <w:tc>
+          <w:tcPr>
+            <w:tcW w:type="dxa" w:w="6426"/>
+            <w:tcBorders>
+              <w:top w:val="single" w:color="CBD5E1" w:sz="4"/>
+              <w:left w:val="single" w:color="CBD5E1" w:sz="4"/>
+              <w:bottom w:val="single" w:color="CBD5E1" w:sz="4"/>
+              <w:right w:val="single" w:color="CBD5E1" w:sz="4"/>
+            </w:tcBorders>
+            <w:tcMar>
+              <w:top w:type="dxa" w:w="120"/>
+              <w:left w:type="dxa" w:w="160"/>
+              <w:bottom w:type="dxa" w:w="120"/>
+              <w:right w:type="dxa" w:w="160"/>
+            </w:tcMar>
+          </w:tcPr>
+          <w:p>
+            <w:pPr>
+              <w:jc w:val="left"/>
+            </w:pPr>
+            <w:r>
+              <w:rPr>
+                <w:rFonts w:ascii="Nunito" w:cs="Nunito" w:eastAsia="Nunito" w:hAnsi="Nunito"/>
+                <w:b/>
+                <w:bCs/>
+                <w:color w:val="0D9488"/>
+                <w:sz w:val="20"/>
+                <w:szCs w:val="20"/>
+              </w:rPr>
+              <w:t xml:space="preserve">https://intern-sync-opal.vercel.app/</w:t>
+            </w:r>
+          </w:p>
+        </w:tc>
+      </w:tr>
+      <w:tr>
+        <w:tc>
+          <w:tcPr>
+            <w:tcW w:type="dxa" w:w="2600"/>
+            <w:tcBorders>
+              <w:top w:val="single" w:color="CBD5E1" w:sz="4"/>
+              <w:left w:val="single" w:color="CBD5E1" w:sz="4"/>
+              <w:bottom w:val="single" w:color="CBD5E1" w:sz="4"/>
+              <w:right w:val="single" w:color="CBD5E1" w:sz="4"/>
+            </w:tcBorders>
+            <w:shd w:fill="F1F5F9" w:val="clear"/>
+            <w:tcMar>
+              <w:top w:type="dxa" w:w="120"/>
+              <w:left w:type="dxa" w:w="160"/>
+              <w:bottom w:type="dxa" w:w="120"/>
+              <w:right w:type="dxa" w:w="160"/>
+            </w:tcMar>
+          </w:tcPr>
+          <w:p>
+            <w:pPr>
+              <w:jc w:val="left"/>
+            </w:pPr>
+            <w:r>
+              <w:rPr>
+                <w:rFonts w:ascii="Nunito" w:cs="Nunito" w:eastAsia="Nunito" w:hAnsi="Nunito"/>
+                <w:b/>
+                <w:bCs/>
+                <w:color w:val="334155"/>
+                <w:sz w:val="20"/>
+                <w:szCs w:val="20"/>
+              </w:rPr>
+              <w:t xml:space="preserve">Repository Proyek</w:t>
             </w:r>
           </w:p>
         </w:tc>
@@ -271,7 +340,7 @@
                 <w:sz w:val="20"/>
                 <w:szCs w:val="20"/>
               </w:rPr>
-              <w:t xml:space="preserve">Peserta PKL/Magang (Siswa SMK/Mahasiswa) &amp; Pembimbing Lapangan Industri</w:t>
+              <w:t xml:space="preserve">https://github.com/Diabyy/InternSync.git</w:t>
             </w:r>
           </w:p>
         </w:tc>
@@ -307,7 +376,7 @@
                 <w:sz w:val="20"/>
                 <w:szCs w:val="20"/>
               </w:rPr>
-              <w:t xml:space="preserve">Stack Teknologi</w:t>
+              <w:t xml:space="preserve">Sasaran Pengguna</w:t>
             </w:r>
           </w:p>
         </w:tc>
@@ -340,7 +409,7 @@
                 <w:sz w:val="20"/>
                 <w:szCs w:val="20"/>
               </w:rPr>
-              <w:t xml:space="preserve">Next.js 16 (App Router), React 19, TypeScript, Tailwind CSS v4</w:t>
+              <w:t xml:space="preserve">Peserta PKL/Magang (Siswa SMK/Mahasiswa) &amp; Pembimbing Lapangan Industri</w:t>
             </w:r>
           </w:p>
         </w:tc>
@@ -376,7 +445,7 @@
                 <w:sz w:val="20"/>
                 <w:szCs w:val="20"/>
               </w:rPr>
-              <w:t xml:space="preserve">Repository Proyek</w:t>
+              <w:t xml:space="preserve">Stack Teknologi</w:t>
             </w:r>
           </w:p>
         </w:tc>
@@ -409,7 +478,7 @@
                 <w:sz w:val="20"/>
                 <w:szCs w:val="20"/>
               </w:rPr>
-              <w:t xml:space="preserve">https://github.com/Diabyy/InternSync.git</w:t>
+              <w:t xml:space="preserve">Next.js 16 (App Router), React 19, TypeScript, Tailwind CSS v4, Vercel</w:t>
             </w:r>
           </w:p>
         </w:tc>
@@ -1245,7 +1314,7 @@
                 <w:sz w:val="20"/>
                 <w:szCs w:val="20"/>
               </w:rPr>
-              <w:t xml:space="preserve">Vercel Edge Network (Otomatisasi CI/CD berbasis Git Push)</w:t>
+              <w:t xml:space="preserve">Vercel Edge Network (Continuous Deployment dari branch main GitHub)</w:t>
             </w:r>
           </w:p>
         </w:tc>
@@ -1401,7 +1470,7 @@
           <w:sz w:val="22"/>
           <w:szCs w:val="22"/>
         </w:rPr>
-        <w:t xml:space="preserve">Seluruh kode sumber, dokumentasi teknis, dan prototipe aplikasi telah dipublikasikan dan dapat diakses melalui tautan resmi berikut:</w:t>
+        <w:t xml:space="preserve">Seluruh kode sumber, dokumentasi teknis, dan aplikasi yang telah aktif dapat diakses melalui tautan resmi berikut:</w:t>
       </w:r>
     </w:p>
     <w:tbl>
@@ -1521,6 +1590,75 @@
                 <w:sz w:val="20"/>
                 <w:szCs w:val="20"/>
               </w:rPr>
+              <w:t xml:space="preserve">Live Website (Vercel)</w:t>
+            </w:r>
+          </w:p>
+        </w:tc>
+        <w:tc>
+          <w:tcPr>
+            <w:tcW w:type="dxa" w:w="6026"/>
+            <w:tcBorders>
+              <w:top w:val="single" w:color="CBD5E1" w:sz="4"/>
+              <w:left w:val="single" w:color="CBD5E1" w:sz="4"/>
+              <w:bottom w:val="single" w:color="CBD5E1" w:sz="4"/>
+              <w:right w:val="single" w:color="CBD5E1" w:sz="4"/>
+            </w:tcBorders>
+            <w:tcMar>
+              <w:top w:type="dxa" w:w="120"/>
+              <w:left w:type="dxa" w:w="160"/>
+              <w:bottom w:type="dxa" w:w="120"/>
+              <w:right w:type="dxa" w:w="160"/>
+            </w:tcMar>
+          </w:tcPr>
+          <w:p>
+            <w:pPr>
+              <w:jc w:val="left"/>
+            </w:pPr>
+            <w:r>
+              <w:rPr>
+                <w:rFonts w:ascii="Nunito" w:cs="Nunito" w:eastAsia="Nunito" w:hAnsi="Nunito"/>
+                <w:b/>
+                <w:bCs/>
+                <w:color w:val="0D9488"/>
+                <w:sz w:val="20"/>
+                <w:szCs w:val="20"/>
+              </w:rPr>
+              <w:t xml:space="preserve">https://intern-sync-opal.vercel.app/</w:t>
+            </w:r>
+          </w:p>
+        </w:tc>
+      </w:tr>
+      <w:tr>
+        <w:tc>
+          <w:tcPr>
+            <w:tcW w:type="dxa" w:w="3000"/>
+            <w:tcBorders>
+              <w:top w:val="single" w:color="CBD5E1" w:sz="4"/>
+              <w:left w:val="single" w:color="CBD5E1" w:sz="4"/>
+              <w:bottom w:val="single" w:color="CBD5E1" w:sz="4"/>
+              <w:right w:val="single" w:color="CBD5E1" w:sz="4"/>
+            </w:tcBorders>
+            <w:shd w:fill="F1F5F9" w:val="clear"/>
+            <w:tcMar>
+              <w:top w:type="dxa" w:w="120"/>
+              <w:left w:type="dxa" w:w="160"/>
+              <w:bottom w:type="dxa" w:w="120"/>
+              <w:right w:type="dxa" w:w="160"/>
+            </w:tcMar>
+          </w:tcPr>
+          <w:p>
+            <w:pPr>
+              <w:jc w:val="left"/>
+            </w:pPr>
+            <w:r>
+              <w:rPr>
+                <w:rFonts w:ascii="Nunito" w:cs="Nunito" w:eastAsia="Nunito" w:hAnsi="Nunito"/>
+                <w:b/>
+                <w:bCs/>
+                <w:color w:val="334155"/>
+                <w:sz w:val="20"/>
+                <w:szCs w:val="20"/>
+              </w:rPr>
               <w:t xml:space="preserve">GitHub Repository</w:t>
             </w:r>
           </w:p>
@@ -1590,7 +1728,7 @@
                 <w:sz w:val="20"/>
                 <w:szCs w:val="20"/>
               </w:rPr>
-              <w:t xml:space="preserve">Status Build Aplikasi</w:t>
+              <w:t xml:space="preserve">Status Deployment</w:t>
             </w:r>
           </w:p>
         </w:tc>
@@ -1623,7 +1761,7 @@
                 <w:sz w:val="20"/>
                 <w:szCs w:val="20"/>
               </w:rPr>
-              <w:t xml:space="preserve">Lulus verifikasi Next.js Turbopack Build (0 Error)</w:t>
+              <w:t xml:space="preserve">Aktif &amp; Terhubung Otomatis (CI/CD Production)</w:t>
             </w:r>
           </w:p>
         </w:tc>

</xml_diff>